<commit_message>
complete sum swing project
</commit_message>
<xml_diff>
--- a/Exercicios/Exercicios.docx
+++ b/Exercicios/Exercicios.docx
@@ -244,7 +244,23 @@
           <w:sz w:val="20"/>
           <w:szCs w:val="20"/>
         </w:rPr>
-        <w:t>Figura: Soma entre dois números</w:t>
+        <w:t>Figura</w:t>
+      </w:r>
+      <w:r>
+        <w:rPr>
+          <w:rFonts w:ascii="Times New Roman" w:hAnsi="Times New Roman" w:cs="Times New Roman"/>
+          <w:sz w:val="20"/>
+          <w:szCs w:val="20"/>
+        </w:rPr>
+        <w:t xml:space="preserve"> 1</w:t>
+      </w:r>
+      <w:r>
+        <w:rPr>
+          <w:rFonts w:ascii="Times New Roman" w:hAnsi="Times New Roman" w:cs="Times New Roman"/>
+          <w:sz w:val="20"/>
+          <w:szCs w:val="20"/>
+        </w:rPr>
+        <w:t>: Soma entre dois números</w:t>
       </w:r>
     </w:p>
     <w:p>
@@ -331,7 +347,23 @@
           <w:sz w:val="20"/>
           <w:szCs w:val="20"/>
         </w:rPr>
-        <w:t xml:space="preserve">Figura: </w:t>
+        <w:t>Figura</w:t>
+      </w:r>
+      <w:r>
+        <w:rPr>
+          <w:rFonts w:ascii="Times New Roman" w:hAnsi="Times New Roman" w:cs="Times New Roman"/>
+          <w:sz w:val="20"/>
+          <w:szCs w:val="20"/>
+        </w:rPr>
+        <w:t xml:space="preserve"> 2</w:t>
+      </w:r>
+      <w:r>
+        <w:rPr>
+          <w:rFonts w:ascii="Times New Roman" w:hAnsi="Times New Roman" w:cs="Times New Roman"/>
+          <w:sz w:val="20"/>
+          <w:szCs w:val="20"/>
+        </w:rPr>
+        <w:t xml:space="preserve">: </w:t>
       </w:r>
       <w:r>
         <w:rPr>
@@ -503,7 +535,23 @@
           <w:sz w:val="20"/>
           <w:szCs w:val="20"/>
         </w:rPr>
-        <w:t xml:space="preserve">Figura: </w:t>
+        <w:t>Figura</w:t>
+      </w:r>
+      <w:r>
+        <w:rPr>
+          <w:rFonts w:ascii="Times New Roman" w:hAnsi="Times New Roman" w:cs="Times New Roman"/>
+          <w:sz w:val="20"/>
+          <w:szCs w:val="20"/>
+        </w:rPr>
+        <w:t xml:space="preserve"> 3</w:t>
+      </w:r>
+      <w:r>
+        <w:rPr>
+          <w:rFonts w:ascii="Times New Roman" w:hAnsi="Times New Roman" w:cs="Times New Roman"/>
+          <w:sz w:val="20"/>
+          <w:szCs w:val="20"/>
+        </w:rPr>
+        <w:t xml:space="preserve">: </w:t>
       </w:r>
       <w:r>
         <w:rPr>

</xml_diff>

<commit_message>
project natural sequence with swing
</commit_message>
<xml_diff>
--- a/Exercicios/Exercicios.docx
+++ b/Exercicios/Exercicios.docx
@@ -1102,6 +1102,7 @@
       <w:r>
         <w:rPr>
           <w:rFonts w:ascii="Times New Roman" w:hAnsi="Times New Roman" w:cs="Times New Roman"/>
+          <w:noProof/>
         </w:rPr>
         <w:drawing>
           <wp:inline distT="0" distB="0" distL="0" distR="0" wp14:anchorId="54C159D8" wp14:editId="2896673C">
@@ -1728,7 +1729,6 @@
           <w:lang w:val="en-US"/>
         </w:rPr>
       </w:pPr>
-      <w:proofErr w:type="spellStart"/>
       <w:r>
         <w:rPr>
           <w:rFonts w:ascii="Times New Roman" w:hAnsi="Times New Roman" w:cs="Times New Roman"/>
@@ -1739,7 +1739,6 @@
         <w:lastRenderedPageBreak/>
         <w:t>Gabarito</w:t>
       </w:r>
-      <w:proofErr w:type="spellEnd"/>
     </w:p>
     <w:p>
       <w:pPr>
@@ -1753,80 +1752,75 @@
           <w:rFonts w:ascii="Times New Roman" w:hAnsi="Times New Roman" w:cs="Times New Roman"/>
           <w:lang w:val="en-US"/>
         </w:rPr>
-        <w:t xml:space="preserve">1. a. </w:t>
-      </w:r>
-      <w:proofErr w:type="spellStart"/>
+        <w:t>1. a. CurrentSystemTime, b. CurrentSystemLanguage, c.</w:t>
+      </w:r>
       <w:r>
         <w:rPr>
           <w:rFonts w:ascii="Times New Roman" w:hAnsi="Times New Roman" w:cs="Times New Roman"/>
           <w:lang w:val="en-US"/>
         </w:rPr>
-        <w:t>CurrentSystemTime</w:t>
-      </w:r>
-      <w:proofErr w:type="spellEnd"/>
-      <w:r>
+        <w:t xml:space="preserve"> SystemScreenResolution</w:t>
+      </w:r>
+    </w:p>
+    <w:p>
+      <w:pPr>
         <w:rPr>
           <w:rFonts w:ascii="Times New Roman" w:hAnsi="Times New Roman" w:cs="Times New Roman"/>
           <w:lang w:val="en-US"/>
         </w:rPr>
-        <w:t xml:space="preserve">, b. </w:t>
-      </w:r>
-      <w:proofErr w:type="spellStart"/>
+      </w:pPr>
       <w:r>
         <w:rPr>
           <w:rFonts w:ascii="Times New Roman" w:hAnsi="Times New Roman" w:cs="Times New Roman"/>
           <w:lang w:val="en-US"/>
         </w:rPr>
-        <w:t>CurrentSystemLanguage</w:t>
-      </w:r>
-      <w:proofErr w:type="spellEnd"/>
-      <w:r>
+        <w:t>2. SumSwing</w:t>
+      </w:r>
+    </w:p>
+    <w:p>
+      <w:pPr>
         <w:rPr>
           <w:rFonts w:ascii="Times New Roman" w:hAnsi="Times New Roman" w:cs="Times New Roman"/>
           <w:lang w:val="en-US"/>
         </w:rPr>
-        <w:t>, c.</w:t>
-      </w:r>
+      </w:pPr>
       <w:r>
         <w:rPr>
           <w:rFonts w:ascii="Times New Roman" w:hAnsi="Times New Roman" w:cs="Times New Roman"/>
           <w:lang w:val="en-US"/>
         </w:rPr>
-        <w:t xml:space="preserve"> </w:t>
-      </w:r>
-      <w:proofErr w:type="spellStart"/>
-      <w:r>
+        <w:t>3. UserAgeSwing</w:t>
+      </w:r>
+    </w:p>
+    <w:p>
+      <w:pPr>
         <w:rPr>
           <w:rFonts w:ascii="Times New Roman" w:hAnsi="Times New Roman" w:cs="Times New Roman"/>
           <w:lang w:val="en-US"/>
         </w:rPr>
-        <w:t>SystemScreenResolution</w:t>
-      </w:r>
-      <w:proofErr w:type="spellEnd"/>
-    </w:p>
-    <w:p>
-      <w:pPr>
+      </w:pPr>
+      <w:r>
         <w:rPr>
           <w:rFonts w:ascii="Times New Roman" w:hAnsi="Times New Roman" w:cs="Times New Roman"/>
           <w:lang w:val="en-US"/>
         </w:rPr>
-      </w:pPr>
-      <w:r>
+        <w:t>4. NumberGuessingSwing</w:t>
+      </w:r>
+    </w:p>
+    <w:p>
+      <w:pPr>
         <w:rPr>
           <w:rFonts w:ascii="Times New Roman" w:hAnsi="Times New Roman" w:cs="Times New Roman"/>
           <w:lang w:val="en-US"/>
         </w:rPr>
-        <w:t xml:space="preserve">2. </w:t>
-      </w:r>
-      <w:proofErr w:type="spellStart"/>
+      </w:pPr>
       <w:r>
         <w:rPr>
           <w:rFonts w:ascii="Times New Roman" w:hAnsi="Times New Roman" w:cs="Times New Roman"/>
           <w:lang w:val="en-US"/>
         </w:rPr>
-        <w:t>SumSwing</w:t>
-      </w:r>
-      <w:proofErr w:type="spellEnd"/>
+        <w:t>5. SuperCalculatorSwing</w:t>
+      </w:r>
     </w:p>
     <w:p>
       <w:pPr>
@@ -1840,41 +1834,38 @@
           <w:rFonts w:ascii="Times New Roman" w:hAnsi="Times New Roman" w:cs="Times New Roman"/>
           <w:lang w:val="en-US"/>
         </w:rPr>
-        <w:t xml:space="preserve">3. </w:t>
-      </w:r>
-      <w:proofErr w:type="spellStart"/>
-      <w:r>
+        <w:t>6. QuadraticFormulaSwing</w:t>
+      </w:r>
+    </w:p>
+    <w:p>
+      <w:pPr>
         <w:rPr>
           <w:rFonts w:ascii="Times New Roman" w:hAnsi="Times New Roman" w:cs="Times New Roman"/>
           <w:lang w:val="en-US"/>
         </w:rPr>
-        <w:t>UserAgeSwing</w:t>
-      </w:r>
-      <w:proofErr w:type="spellEnd"/>
-    </w:p>
-    <w:p>
-      <w:pPr>
+      </w:pPr>
+      <w:r>
         <w:rPr>
           <w:rFonts w:ascii="Times New Roman" w:hAnsi="Times New Roman" w:cs="Times New Roman"/>
           <w:lang w:val="en-US"/>
         </w:rPr>
-      </w:pPr>
-      <w:r>
+        <w:t>7. TriangleClassifierSwing</w:t>
+      </w:r>
+    </w:p>
+    <w:p>
+      <w:pPr>
         <w:rPr>
           <w:rFonts w:ascii="Times New Roman" w:hAnsi="Times New Roman" w:cs="Times New Roman"/>
           <w:lang w:val="en-US"/>
         </w:rPr>
-        <w:t xml:space="preserve">4. </w:t>
-      </w:r>
-      <w:proofErr w:type="spellStart"/>
+      </w:pPr>
       <w:r>
         <w:rPr>
           <w:rFonts w:ascii="Times New Roman" w:hAnsi="Times New Roman" w:cs="Times New Roman"/>
           <w:lang w:val="en-US"/>
         </w:rPr>
-        <w:t>NumberGuessingSwing</w:t>
-      </w:r>
-      <w:proofErr w:type="spellEnd"/>
+        <w:t>8. FactorialSwing</w:t>
+      </w:r>
     </w:p>
     <w:p>
       <w:pPr>
@@ -1888,127 +1879,29 @@
           <w:rFonts w:ascii="Times New Roman" w:hAnsi="Times New Roman" w:cs="Times New Roman"/>
           <w:lang w:val="en-US"/>
         </w:rPr>
-        <w:t xml:space="preserve">5. </w:t>
-      </w:r>
-      <w:proofErr w:type="spellStart"/>
-      <w:r>
+        <w:t>9. StatisticsSwing</w:t>
+      </w:r>
+    </w:p>
+    <w:p>
+      <w:pPr>
         <w:rPr>
           <w:rFonts w:ascii="Times New Roman" w:hAnsi="Times New Roman" w:cs="Times New Roman"/>
           <w:lang w:val="en-US"/>
         </w:rPr>
-        <w:t>SuperCalculatorSwing</w:t>
-      </w:r>
-      <w:proofErr w:type="spellEnd"/>
-    </w:p>
-    <w:p>
-      <w:pPr>
+      </w:pPr>
+      <w:r>
         <w:rPr>
           <w:rFonts w:ascii="Times New Roman" w:hAnsi="Times New Roman" w:cs="Times New Roman"/>
           <w:lang w:val="en-US"/>
         </w:rPr>
-      </w:pPr>
+        <w:t>10.</w:t>
+      </w:r>
       <w:r>
         <w:rPr>
           <w:rFonts w:ascii="Times New Roman" w:hAnsi="Times New Roman" w:cs="Times New Roman"/>
           <w:lang w:val="en-US"/>
         </w:rPr>
-        <w:t xml:space="preserve">6. </w:t>
-      </w:r>
-      <w:proofErr w:type="spellStart"/>
-      <w:r>
-        <w:rPr>
-          <w:rFonts w:ascii="Times New Roman" w:hAnsi="Times New Roman" w:cs="Times New Roman"/>
-          <w:lang w:val="en-US"/>
-        </w:rPr>
-        <w:t>QuadraticFormulaSwing</w:t>
-      </w:r>
-      <w:proofErr w:type="spellEnd"/>
-    </w:p>
-    <w:p>
-      <w:pPr>
-        <w:rPr>
-          <w:rFonts w:ascii="Times New Roman" w:hAnsi="Times New Roman" w:cs="Times New Roman"/>
-          <w:lang w:val="en-US"/>
-        </w:rPr>
-      </w:pPr>
-      <w:r>
-        <w:rPr>
-          <w:rFonts w:ascii="Times New Roman" w:hAnsi="Times New Roman" w:cs="Times New Roman"/>
-          <w:lang w:val="en-US"/>
-        </w:rPr>
-        <w:t xml:space="preserve">7. </w:t>
-      </w:r>
-      <w:proofErr w:type="spellStart"/>
-      <w:r>
-        <w:rPr>
-          <w:rFonts w:ascii="Times New Roman" w:hAnsi="Times New Roman" w:cs="Times New Roman"/>
-          <w:lang w:val="en-US"/>
-        </w:rPr>
-        <w:t>TriangleClassifierSwing</w:t>
-      </w:r>
-      <w:proofErr w:type="spellEnd"/>
-    </w:p>
-    <w:p>
-      <w:pPr>
-        <w:rPr>
-          <w:rFonts w:ascii="Times New Roman" w:hAnsi="Times New Roman" w:cs="Times New Roman"/>
-          <w:lang w:val="en-US"/>
-        </w:rPr>
-      </w:pPr>
-      <w:r>
-        <w:rPr>
-          <w:rFonts w:ascii="Times New Roman" w:hAnsi="Times New Roman" w:cs="Times New Roman"/>
-          <w:lang w:val="en-US"/>
-        </w:rPr>
-        <w:t xml:space="preserve">8. </w:t>
-      </w:r>
-      <w:proofErr w:type="spellStart"/>
-      <w:r>
-        <w:rPr>
-          <w:rFonts w:ascii="Times New Roman" w:hAnsi="Times New Roman" w:cs="Times New Roman"/>
-          <w:lang w:val="en-US"/>
-        </w:rPr>
-        <w:t>FactorialSwing</w:t>
-      </w:r>
-      <w:proofErr w:type="spellEnd"/>
-    </w:p>
-    <w:p>
-      <w:pPr>
-        <w:rPr>
-          <w:rFonts w:ascii="Times New Roman" w:hAnsi="Times New Roman" w:cs="Times New Roman"/>
-          <w:lang w:val="en-US"/>
-        </w:rPr>
-      </w:pPr>
-      <w:r>
-        <w:rPr>
-          <w:rFonts w:ascii="Times New Roman" w:hAnsi="Times New Roman" w:cs="Times New Roman"/>
-          <w:lang w:val="en-US"/>
-        </w:rPr>
-        <w:t xml:space="preserve">9. </w:t>
-      </w:r>
-      <w:proofErr w:type="spellStart"/>
-      <w:r>
-        <w:rPr>
-          <w:rFonts w:ascii="Times New Roman" w:hAnsi="Times New Roman" w:cs="Times New Roman"/>
-          <w:lang w:val="en-US"/>
-        </w:rPr>
-        <w:t>StatisticsSwing</w:t>
-      </w:r>
-      <w:proofErr w:type="spellEnd"/>
-    </w:p>
-    <w:p>
-      <w:pPr>
-        <w:rPr>
-          <w:rFonts w:ascii="Times New Roman" w:hAnsi="Times New Roman" w:cs="Times New Roman"/>
-          <w:lang w:val="en-US"/>
-        </w:rPr>
-      </w:pPr>
-      <w:r>
-        <w:rPr>
-          <w:rFonts w:ascii="Times New Roman" w:hAnsi="Times New Roman" w:cs="Times New Roman"/>
-          <w:lang w:val="en-US"/>
-        </w:rPr>
-        <w:t>10.</w:t>
+        <w:t xml:space="preserve"> NaturalSequenceSwing</w:t>
       </w:r>
     </w:p>
     <w:p>

</xml_diff>